<commit_message>
grab all relevant data from API and standardise
</commit_message>
<xml_diff>
--- a/Design/(5) rank_comparison.docx
+++ b/Design/(5) rank_comparison.docx
@@ -508,7 +508,7 @@
           <w:sz w:val="22"/>
           <w:szCs w:val="22"/>
         </w:rPr>
-        <w:t>Time spent between players</w:t>
+        <w:t>Time spent as most forward player</w:t>
       </w:r>
     </w:p>
     <w:p>
@@ -530,7 +530,7 @@
           <w:sz w:val="22"/>
           <w:szCs w:val="22"/>
         </w:rPr>
-        <w:t>Time spent as most forward player</w:t>
+        <w:t>Time spent closest to ball</w:t>
       </w:r>
     </w:p>
     <w:p>
@@ -552,7 +552,7 @@
           <w:sz w:val="22"/>
           <w:szCs w:val="22"/>
         </w:rPr>
-        <w:t>Time spent closest to ball</w:t>
+        <w:t>Time spent farthest from ball</w:t>
       </w:r>
     </w:p>
     <w:p>
@@ -574,7 +574,7 @@
           <w:sz w:val="22"/>
           <w:szCs w:val="22"/>
         </w:rPr>
-        <w:t>Time spent farthest from ball</w:t>
+        <w:t>Time spent behind the ball</w:t>
       </w:r>
     </w:p>
     <w:p>
@@ -596,7 +596,7 @@
           <w:sz w:val="22"/>
           <w:szCs w:val="22"/>
         </w:rPr>
-        <w:t>Time spent behind the ball</w:t>
+        <w:t>Time spent ahead of the ball</w:t>
       </w:r>
     </w:p>
     <w:p>
@@ -618,7 +618,7 @@
           <w:sz w:val="22"/>
           <w:szCs w:val="22"/>
         </w:rPr>
-        <w:t>Time spent ahead of the ball</w:t>
+        <w:t>Time spent in the defending third</w:t>
       </w:r>
     </w:p>
     <w:p>
@@ -640,7 +640,7 @@
           <w:sz w:val="22"/>
           <w:szCs w:val="22"/>
         </w:rPr>
-        <w:t>Time spent in the defending third</w:t>
+        <w:t>Time spent in the neutral third</w:t>
       </w:r>
     </w:p>
     <w:p>
@@ -662,28 +662,6 @@
           <w:sz w:val="22"/>
           <w:szCs w:val="22"/>
         </w:rPr>
-        <w:t>Time spent in the neutral third</w:t>
-      </w:r>
-    </w:p>
-    <w:p>
-      <w:pPr>
-        <w:pStyle w:val="ListParagraph"/>
-        <w:numPr>
-          <w:ilvl w:val="0"/>
-          <w:numId w:val="3"/>
-        </w:numPr>
-        <w:rPr>
-          <w:rFonts w:ascii="Calibri" w:hAnsi="Calibri" w:cs="Calibri"/>
-          <w:sz w:val="22"/>
-          <w:szCs w:val="22"/>
-        </w:rPr>
-      </w:pPr>
-      <w:r>
-        <w:rPr>
-          <w:rFonts w:ascii="Calibri" w:hAnsi="Calibri" w:cs="Calibri"/>
-          <w:sz w:val="22"/>
-          <w:szCs w:val="22"/>
-        </w:rPr>
         <w:t>Time spent in the attacking third</w:t>
       </w:r>
     </w:p>
@@ -833,25 +811,25 @@
           <w:sz w:val="22"/>
           <w:szCs w:val="22"/>
         </w:rPr>
+        <w:t>Average duration of possession</w:t>
+      </w:r>
+    </w:p>
+    <w:p>
+      <w:pPr>
+        <w:ind w:left="360"/>
+        <w:rPr>
+          <w:rFonts w:ascii="Calibri" w:hAnsi="Calibri" w:cs="Calibri"/>
+          <w:sz w:val="22"/>
+          <w:szCs w:val="22"/>
+        </w:rPr>
+      </w:pPr>
+      <w:r>
+        <w:rPr>
+          <w:rFonts w:ascii="Calibri" w:hAnsi="Calibri" w:cs="Calibri"/>
+          <w:sz w:val="22"/>
+          <w:szCs w:val="22"/>
+        </w:rPr>
         <w:lastRenderedPageBreak/>
-        <w:t>Average duration of possession</w:t>
-      </w:r>
-    </w:p>
-    <w:p>
-      <w:pPr>
-        <w:ind w:left="360"/>
-        <w:rPr>
-          <w:rFonts w:ascii="Calibri" w:hAnsi="Calibri" w:cs="Calibri"/>
-          <w:sz w:val="22"/>
-          <w:szCs w:val="22"/>
-        </w:rPr>
-      </w:pPr>
-      <w:r>
-        <w:rPr>
-          <w:rFonts w:ascii="Calibri" w:hAnsi="Calibri" w:cs="Calibri"/>
-          <w:sz w:val="22"/>
-          <w:szCs w:val="22"/>
-        </w:rPr>
         <w:t xml:space="preserve">Justification for each statistic is included in </w:t>
       </w:r>
       <w:r>
@@ -934,6 +912,7 @@
       <w:r>
         <w:rPr>
           <w:rFonts w:ascii="Calibri" w:hAnsi="Calibri" w:cs="Calibri"/>
+          <w:noProof/>
         </w:rPr>
         <w:drawing>
           <wp:inline distT="0" distB="0" distL="0" distR="0" wp14:anchorId="1C9AA92F" wp14:editId="1EBD9B78">
@@ -1166,7 +1145,6 @@
           <w:sz w:val="22"/>
           <w:szCs w:val="22"/>
         </w:rPr>
-        <w:lastRenderedPageBreak/>
         <w:t xml:space="preserve">The aim of this part will be to meet </w:t>
       </w:r>
       <w:r>
@@ -1235,7 +1213,16 @@
           <w:sz w:val="22"/>
           <w:szCs w:val="22"/>
         </w:rPr>
-        <w:t xml:space="preserve"> try to guide them to figure out why their data is so different to most, and potentially what to do about it.</w:t>
+        <w:t xml:space="preserve"> try </w:t>
+      </w:r>
+      <w:r>
+        <w:rPr>
+          <w:rFonts w:ascii="Calibri" w:hAnsi="Calibri" w:cs="Calibri"/>
+          <w:sz w:val="22"/>
+          <w:szCs w:val="22"/>
+        </w:rPr>
+        <w:lastRenderedPageBreak/>
+        <w:t>to guide them to figure out why their data is so different to most, and potentially what to do about it.</w:t>
       </w:r>
     </w:p>
     <w:p>
@@ -1250,6 +1237,7 @@
       <w:r>
         <w:rPr>
           <w:rFonts w:ascii="Calibri" w:hAnsi="Calibri" w:cs="Calibri"/>
+          <w:noProof/>
           <w:sz w:val="22"/>
           <w:szCs w:val="22"/>
         </w:rPr>

</xml_diff>